<commit_message>
doc: document update the convention
</commit_message>
<xml_diff>
--- a/document/FullStack_Convention_Or_Best_practice_Guide.docx
+++ b/document/FullStack_Convention_Or_Best_practice_Guide.docx
@@ -126,12 +126,6 @@
         <w:gridCol w:w="5760"/>
       </w:tblGrid>
       <w:tr>
-        <w:tblPrEx>
-          <w:tblCellMar>
-            <w:top w:w="0" w:type="dxa"/>
-            <w:bottom w:w="0" w:type="dxa"/>
-          </w:tblCellMar>
-        </w:tblPrEx>
         <w:trPr>
           <w:tblHeader/>
         </w:trPr>
@@ -199,12 +193,6 @@
         </w:tc>
       </w:tr>
       <w:tr>
-        <w:tblPrEx>
-          <w:tblCellMar>
-            <w:top w:w="0" w:type="dxa"/>
-            <w:bottom w:w="0" w:type="dxa"/>
-          </w:tblCellMar>
-        </w:tblPrEx>
         <w:tc>
           <w:tcPr>
             <w:tcW w:w="3600" w:type="dxa"/>
@@ -261,12 +249,6 @@
         </w:tc>
       </w:tr>
       <w:tr>
-        <w:tblPrEx>
-          <w:tblCellMar>
-            <w:top w:w="0" w:type="dxa"/>
-            <w:bottom w:w="0" w:type="dxa"/>
-          </w:tblCellMar>
-        </w:tblPrEx>
         <w:tc>
           <w:tcPr>
             <w:tcW w:w="3600" w:type="dxa"/>
@@ -323,12 +305,6 @@
         </w:tc>
       </w:tr>
       <w:tr>
-        <w:tblPrEx>
-          <w:tblCellMar>
-            <w:top w:w="0" w:type="dxa"/>
-            <w:bottom w:w="0" w:type="dxa"/>
-          </w:tblCellMar>
-        </w:tblPrEx>
         <w:tc>
           <w:tcPr>
             <w:tcW w:w="3600" w:type="dxa"/>
@@ -385,12 +361,6 @@
         </w:tc>
       </w:tr>
       <w:tr>
-        <w:tblPrEx>
-          <w:tblCellMar>
-            <w:top w:w="0" w:type="dxa"/>
-            <w:bottom w:w="0" w:type="dxa"/>
-          </w:tblCellMar>
-        </w:tblPrEx>
         <w:tc>
           <w:tcPr>
             <w:tcW w:w="3600" w:type="dxa"/>
@@ -479,12 +449,6 @@
         </w:tc>
       </w:tr>
       <w:tr>
-        <w:tblPrEx>
-          <w:tblCellMar>
-            <w:top w:w="0" w:type="dxa"/>
-            <w:bottom w:w="0" w:type="dxa"/>
-          </w:tblCellMar>
-        </w:tblPrEx>
         <w:tc>
           <w:tcPr>
             <w:tcW w:w="3600" w:type="dxa"/>
@@ -573,12 +537,6 @@
         </w:tc>
       </w:tr>
       <w:tr>
-        <w:tblPrEx>
-          <w:tblCellMar>
-            <w:top w:w="0" w:type="dxa"/>
-            <w:bottom w:w="0" w:type="dxa"/>
-          </w:tblCellMar>
-        </w:tblPrEx>
         <w:tc>
           <w:tcPr>
             <w:tcW w:w="3600" w:type="dxa"/>
@@ -651,12 +609,6 @@
         </w:tc>
       </w:tr>
       <w:tr>
-        <w:tblPrEx>
-          <w:tblCellMar>
-            <w:top w:w="0" w:type="dxa"/>
-            <w:bottom w:w="0" w:type="dxa"/>
-          </w:tblCellMar>
-        </w:tblPrEx>
         <w:tc>
           <w:tcPr>
             <w:tcW w:w="3600" w:type="dxa"/>
@@ -791,12 +743,6 @@
         <w:gridCol w:w="9360"/>
       </w:tblGrid>
       <w:tr>
-        <w:tblPrEx>
-          <w:tblCellMar>
-            <w:top w:w="0" w:type="dxa"/>
-            <w:bottom w:w="0" w:type="dxa"/>
-          </w:tblCellMar>
-        </w:tblPrEx>
         <w:tc>
           <w:tcPr>
             <w:tcW w:w="9360" w:type="dxa"/>
@@ -925,12 +871,6 @@
         <w:gridCol w:w="3480"/>
       </w:tblGrid>
       <w:tr>
-        <w:tblPrEx>
-          <w:tblCellMar>
-            <w:top w:w="0" w:type="dxa"/>
-            <w:bottom w:w="0" w:type="dxa"/>
-          </w:tblCellMar>
-        </w:tblPrEx>
         <w:trPr>
           <w:tblHeader/>
         </w:trPr>
@@ -1029,12 +969,6 @@
         </w:tc>
       </w:tr>
       <w:tr>
-        <w:tblPrEx>
-          <w:tblCellMar>
-            <w:top w:w="0" w:type="dxa"/>
-            <w:bottom w:w="0" w:type="dxa"/>
-          </w:tblCellMar>
-        </w:tblPrEx>
         <w:tc>
           <w:tcPr>
             <w:tcW w:w="2200" w:type="dxa"/>
@@ -1118,12 +1052,6 @@
         </w:tc>
       </w:tr>
       <w:tr>
-        <w:tblPrEx>
-          <w:tblCellMar>
-            <w:top w:w="0" w:type="dxa"/>
-            <w:bottom w:w="0" w:type="dxa"/>
-          </w:tblCellMar>
-        </w:tblPrEx>
         <w:tc>
           <w:tcPr>
             <w:tcW w:w="2200" w:type="dxa"/>
@@ -1207,12 +1135,6 @@
         </w:tc>
       </w:tr>
       <w:tr>
-        <w:tblPrEx>
-          <w:tblCellMar>
-            <w:top w:w="0" w:type="dxa"/>
-            <w:bottom w:w="0" w:type="dxa"/>
-          </w:tblCellMar>
-        </w:tblPrEx>
         <w:tc>
           <w:tcPr>
             <w:tcW w:w="2200" w:type="dxa"/>
@@ -1296,12 +1218,6 @@
         </w:tc>
       </w:tr>
       <w:tr>
-        <w:tblPrEx>
-          <w:tblCellMar>
-            <w:top w:w="0" w:type="dxa"/>
-            <w:bottom w:w="0" w:type="dxa"/>
-          </w:tblCellMar>
-        </w:tblPrEx>
         <w:tc>
           <w:tcPr>
             <w:tcW w:w="2200" w:type="dxa"/>
@@ -2030,12 +1946,6 @@
         <w:gridCol w:w="2960"/>
       </w:tblGrid>
       <w:tr>
-        <w:tblPrEx>
-          <w:tblCellMar>
-            <w:top w:w="0" w:type="dxa"/>
-            <w:bottom w:w="0" w:type="dxa"/>
-          </w:tblCellMar>
-        </w:tblPrEx>
         <w:trPr>
           <w:tblHeader/>
         </w:trPr>
@@ -2134,12 +2044,6 @@
         </w:tc>
       </w:tr>
       <w:tr>
-        <w:tblPrEx>
-          <w:tblCellMar>
-            <w:top w:w="0" w:type="dxa"/>
-            <w:bottom w:w="0" w:type="dxa"/>
-          </w:tblCellMar>
-        </w:tblPrEx>
         <w:tc>
           <w:tcPr>
             <w:tcW w:w="2400" w:type="dxa"/>
@@ -2223,12 +2127,6 @@
         </w:tc>
       </w:tr>
       <w:tr>
-        <w:tblPrEx>
-          <w:tblCellMar>
-            <w:top w:w="0" w:type="dxa"/>
-            <w:bottom w:w="0" w:type="dxa"/>
-          </w:tblCellMar>
-        </w:tblPrEx>
         <w:tc>
           <w:tcPr>
             <w:tcW w:w="2400" w:type="dxa"/>
@@ -2330,12 +2228,6 @@
         </w:tc>
       </w:tr>
       <w:tr>
-        <w:tblPrEx>
-          <w:tblCellMar>
-            <w:top w:w="0" w:type="dxa"/>
-            <w:bottom w:w="0" w:type="dxa"/>
-          </w:tblCellMar>
-        </w:tblPrEx>
         <w:tc>
           <w:tcPr>
             <w:tcW w:w="2400" w:type="dxa"/>
@@ -2428,12 +2320,6 @@
         </w:tc>
       </w:tr>
       <w:tr>
-        <w:tblPrEx>
-          <w:tblCellMar>
-            <w:top w:w="0" w:type="dxa"/>
-            <w:bottom w:w="0" w:type="dxa"/>
-          </w:tblCellMar>
-        </w:tblPrEx>
         <w:tc>
           <w:tcPr>
             <w:tcW w:w="2400" w:type="dxa"/>
@@ -2555,12 +2441,6 @@
         <w:gridCol w:w="7160"/>
       </w:tblGrid>
       <w:tr>
-        <w:tblPrEx>
-          <w:tblCellMar>
-            <w:top w:w="0" w:type="dxa"/>
-            <w:bottom w:w="0" w:type="dxa"/>
-          </w:tblCellMar>
-        </w:tblPrEx>
         <w:trPr>
           <w:tblHeader/>
         </w:trPr>
@@ -2628,12 +2508,6 @@
         </w:tc>
       </w:tr>
       <w:tr>
-        <w:tblPrEx>
-          <w:tblCellMar>
-            <w:top w:w="0" w:type="dxa"/>
-            <w:bottom w:w="0" w:type="dxa"/>
-          </w:tblCellMar>
-        </w:tblPrEx>
         <w:tc>
           <w:tcPr>
             <w:tcW w:w="2200" w:type="dxa"/>
@@ -2690,12 +2564,6 @@
         </w:tc>
       </w:tr>
       <w:tr>
-        <w:tblPrEx>
-          <w:tblCellMar>
-            <w:top w:w="0" w:type="dxa"/>
-            <w:bottom w:w="0" w:type="dxa"/>
-          </w:tblCellMar>
-        </w:tblPrEx>
         <w:tc>
           <w:tcPr>
             <w:tcW w:w="2200" w:type="dxa"/>
@@ -2752,12 +2620,6 @@
         </w:tc>
       </w:tr>
       <w:tr>
-        <w:tblPrEx>
-          <w:tblCellMar>
-            <w:top w:w="0" w:type="dxa"/>
-            <w:bottom w:w="0" w:type="dxa"/>
-          </w:tblCellMar>
-        </w:tblPrEx>
         <w:tc>
           <w:tcPr>
             <w:tcW w:w="2200" w:type="dxa"/>
@@ -2814,12 +2676,6 @@
         </w:tc>
       </w:tr>
       <w:tr>
-        <w:tblPrEx>
-          <w:tblCellMar>
-            <w:top w:w="0" w:type="dxa"/>
-            <w:bottom w:w="0" w:type="dxa"/>
-          </w:tblCellMar>
-        </w:tblPrEx>
         <w:tc>
           <w:tcPr>
             <w:tcW w:w="2200" w:type="dxa"/>
@@ -2876,12 +2732,6 @@
         </w:tc>
       </w:tr>
       <w:tr>
-        <w:tblPrEx>
-          <w:tblCellMar>
-            <w:top w:w="0" w:type="dxa"/>
-            <w:bottom w:w="0" w:type="dxa"/>
-          </w:tblCellMar>
-        </w:tblPrEx>
         <w:tc>
           <w:tcPr>
             <w:tcW w:w="2200" w:type="dxa"/>
@@ -2938,12 +2788,6 @@
         </w:tc>
       </w:tr>
       <w:tr>
-        <w:tblPrEx>
-          <w:tblCellMar>
-            <w:top w:w="0" w:type="dxa"/>
-            <w:bottom w:w="0" w:type="dxa"/>
-          </w:tblCellMar>
-        </w:tblPrEx>
         <w:tc>
           <w:tcPr>
             <w:tcW w:w="2200" w:type="dxa"/>
@@ -3000,12 +2844,6 @@
         </w:tc>
       </w:tr>
       <w:tr>
-        <w:tblPrEx>
-          <w:tblCellMar>
-            <w:top w:w="0" w:type="dxa"/>
-            <w:bottom w:w="0" w:type="dxa"/>
-          </w:tblCellMar>
-        </w:tblPrEx>
         <w:tc>
           <w:tcPr>
             <w:tcW w:w="2200" w:type="dxa"/>
@@ -3078,12 +2916,6 @@
         </w:tc>
       </w:tr>
       <w:tr>
-        <w:tblPrEx>
-          <w:tblCellMar>
-            <w:top w:w="0" w:type="dxa"/>
-            <w:bottom w:w="0" w:type="dxa"/>
-          </w:tblCellMar>
-        </w:tblPrEx>
         <w:tc>
           <w:tcPr>
             <w:tcW w:w="2200" w:type="dxa"/>
@@ -3140,12 +2972,6 @@
         </w:tc>
       </w:tr>
       <w:tr>
-        <w:tblPrEx>
-          <w:tblCellMar>
-            <w:top w:w="0" w:type="dxa"/>
-            <w:bottom w:w="0" w:type="dxa"/>
-          </w:tblCellMar>
-        </w:tblPrEx>
         <w:tc>
           <w:tcPr>
             <w:tcW w:w="2200" w:type="dxa"/>
@@ -3203,12 +3029,6 @@
         </w:tc>
       </w:tr>
       <w:tr>
-        <w:tblPrEx>
-          <w:tblCellMar>
-            <w:top w:w="0" w:type="dxa"/>
-            <w:bottom w:w="0" w:type="dxa"/>
-          </w:tblCellMar>
-        </w:tblPrEx>
         <w:tc>
           <w:tcPr>
             <w:tcW w:w="2200" w:type="dxa"/>
@@ -3378,12 +3198,6 @@
         <w:gridCol w:w="9360"/>
       </w:tblGrid>
       <w:tr>
-        <w:tblPrEx>
-          <w:tblCellMar>
-            <w:top w:w="0" w:type="dxa"/>
-            <w:bottom w:w="0" w:type="dxa"/>
-          </w:tblCellMar>
-        </w:tblPrEx>
         <w:tc>
           <w:tcPr>
             <w:tcW w:w="9360" w:type="dxa"/>
@@ -3739,12 +3553,6 @@
         <w:gridCol w:w="9360"/>
       </w:tblGrid>
       <w:tr>
-        <w:tblPrEx>
-          <w:tblCellMar>
-            <w:top w:w="0" w:type="dxa"/>
-            <w:bottom w:w="0" w:type="dxa"/>
-          </w:tblCellMar>
-        </w:tblPrEx>
         <w:tc>
           <w:tcPr>
             <w:tcW w:w="9360" w:type="dxa"/>
@@ -3838,12 +3646,6 @@
         <w:gridCol w:w="2600"/>
       </w:tblGrid>
       <w:tr>
-        <w:tblPrEx>
-          <w:tblCellMar>
-            <w:top w:w="0" w:type="dxa"/>
-            <w:bottom w:w="0" w:type="dxa"/>
-          </w:tblCellMar>
-        </w:tblPrEx>
         <w:trPr>
           <w:tblHeader/>
         </w:trPr>
@@ -3942,12 +3744,6 @@
         </w:tc>
       </w:tr>
       <w:tr>
-        <w:tblPrEx>
-          <w:tblCellMar>
-            <w:top w:w="0" w:type="dxa"/>
-            <w:bottom w:w="0" w:type="dxa"/>
-          </w:tblCellMar>
-        </w:tblPrEx>
         <w:tc>
           <w:tcPr>
             <w:tcW w:w="2400" w:type="dxa"/>
@@ -4031,12 +3827,6 @@
         </w:tc>
       </w:tr>
       <w:tr>
-        <w:tblPrEx>
-          <w:tblCellMar>
-            <w:top w:w="0" w:type="dxa"/>
-            <w:bottom w:w="0" w:type="dxa"/>
-          </w:tblCellMar>
-        </w:tblPrEx>
         <w:tc>
           <w:tcPr>
             <w:tcW w:w="2400" w:type="dxa"/>
@@ -4129,12 +3919,6 @@
         </w:tc>
       </w:tr>
       <w:tr>
-        <w:tblPrEx>
-          <w:tblCellMar>
-            <w:top w:w="0" w:type="dxa"/>
-            <w:bottom w:w="0" w:type="dxa"/>
-          </w:tblCellMar>
-        </w:tblPrEx>
         <w:tc>
           <w:tcPr>
             <w:tcW w:w="2400" w:type="dxa"/>
@@ -4236,12 +4020,6 @@
         </w:tc>
       </w:tr>
       <w:tr>
-        <w:tblPrEx>
-          <w:tblCellMar>
-            <w:top w:w="0" w:type="dxa"/>
-            <w:bottom w:w="0" w:type="dxa"/>
-          </w:tblCellMar>
-        </w:tblPrEx>
         <w:tc>
           <w:tcPr>
             <w:tcW w:w="2400" w:type="dxa"/>
@@ -4385,12 +4163,6 @@
         <w:gridCol w:w="9360"/>
       </w:tblGrid>
       <w:tr>
-        <w:tblPrEx>
-          <w:tblCellMar>
-            <w:top w:w="0" w:type="dxa"/>
-            <w:bottom w:w="0" w:type="dxa"/>
-          </w:tblCellMar>
-        </w:tblPrEx>
         <w:tc>
           <w:tcPr>
             <w:tcW w:w="9360" w:type="dxa"/>
@@ -4767,12 +4539,6 @@
         <w:gridCol w:w="4160"/>
       </w:tblGrid>
       <w:tr>
-        <w:tblPrEx>
-          <w:tblCellMar>
-            <w:top w:w="0" w:type="dxa"/>
-            <w:bottom w:w="0" w:type="dxa"/>
-          </w:tblCellMar>
-        </w:tblPrEx>
         <w:trPr>
           <w:tblHeader/>
         </w:trPr>
@@ -4871,12 +4637,6 @@
         </w:tc>
       </w:tr>
       <w:tr>
-        <w:tblPrEx>
-          <w:tblCellMar>
-            <w:top w:w="0" w:type="dxa"/>
-            <w:bottom w:w="0" w:type="dxa"/>
-          </w:tblCellMar>
-        </w:tblPrEx>
         <w:tc>
           <w:tcPr>
             <w:tcW w:w="2400" w:type="dxa"/>
@@ -4960,12 +4720,6 @@
         </w:tc>
       </w:tr>
       <w:tr>
-        <w:tblPrEx>
-          <w:tblCellMar>
-            <w:top w:w="0" w:type="dxa"/>
-            <w:bottom w:w="0" w:type="dxa"/>
-          </w:tblCellMar>
-        </w:tblPrEx>
         <w:tc>
           <w:tcPr>
             <w:tcW w:w="2400" w:type="dxa"/>
@@ -5049,12 +4803,6 @@
         </w:tc>
       </w:tr>
       <w:tr>
-        <w:tblPrEx>
-          <w:tblCellMar>
-            <w:top w:w="0" w:type="dxa"/>
-            <w:bottom w:w="0" w:type="dxa"/>
-          </w:tblCellMar>
-        </w:tblPrEx>
         <w:tc>
           <w:tcPr>
             <w:tcW w:w="2400" w:type="dxa"/>
@@ -5140,12 +4888,6 @@
         </w:tc>
       </w:tr>
       <w:tr>
-        <w:tblPrEx>
-          <w:tblCellMar>
-            <w:top w:w="0" w:type="dxa"/>
-            <w:bottom w:w="0" w:type="dxa"/>
-          </w:tblCellMar>
-        </w:tblPrEx>
         <w:tc>
           <w:tcPr>
             <w:tcW w:w="2400" w:type="dxa"/>
@@ -5245,12 +4987,6 @@
         </w:tc>
       </w:tr>
       <w:tr>
-        <w:tblPrEx>
-          <w:tblCellMar>
-            <w:top w:w="0" w:type="dxa"/>
-            <w:bottom w:w="0" w:type="dxa"/>
-          </w:tblCellMar>
-        </w:tblPrEx>
         <w:tc>
           <w:tcPr>
             <w:tcW w:w="2400" w:type="dxa"/>
@@ -5336,12 +5072,6 @@
         </w:tc>
       </w:tr>
       <w:tr>
-        <w:tblPrEx>
-          <w:tblCellMar>
-            <w:top w:w="0" w:type="dxa"/>
-            <w:bottom w:w="0" w:type="dxa"/>
-          </w:tblCellMar>
-        </w:tblPrEx>
         <w:tc>
           <w:tcPr>
             <w:tcW w:w="2400" w:type="dxa"/>
@@ -5425,12 +5155,6 @@
         </w:tc>
       </w:tr>
       <w:tr>
-        <w:tblPrEx>
-          <w:tblCellMar>
-            <w:top w:w="0" w:type="dxa"/>
-            <w:bottom w:w="0" w:type="dxa"/>
-          </w:tblCellMar>
-        </w:tblPrEx>
         <w:tc>
           <w:tcPr>
             <w:tcW w:w="2400" w:type="dxa"/>
@@ -5514,12 +5238,6 @@
         </w:tc>
       </w:tr>
       <w:tr>
-        <w:tblPrEx>
-          <w:tblCellMar>
-            <w:top w:w="0" w:type="dxa"/>
-            <w:bottom w:w="0" w:type="dxa"/>
-          </w:tblCellMar>
-        </w:tblPrEx>
         <w:tc>
           <w:tcPr>
             <w:tcW w:w="2400" w:type="dxa"/>
@@ -5605,12 +5323,6 @@
         </w:tc>
       </w:tr>
       <w:tr>
-        <w:tblPrEx>
-          <w:tblCellMar>
-            <w:top w:w="0" w:type="dxa"/>
-            <w:bottom w:w="0" w:type="dxa"/>
-          </w:tblCellMar>
-        </w:tblPrEx>
         <w:tc>
           <w:tcPr>
             <w:tcW w:w="2400" w:type="dxa"/>
@@ -5696,12 +5408,6 @@
         </w:tc>
       </w:tr>
       <w:tr>
-        <w:tblPrEx>
-          <w:tblCellMar>
-            <w:top w:w="0" w:type="dxa"/>
-            <w:bottom w:w="0" w:type="dxa"/>
-          </w:tblCellMar>
-        </w:tblPrEx>
         <w:tc>
           <w:tcPr>
             <w:tcW w:w="2400" w:type="dxa"/>
@@ -5796,6 +5502,116 @@
                 <w:szCs w:val="20"/>
               </w:rPr>
               <w:t>; minimal re-renders</w:t>
+            </w:r>
+          </w:p>
+        </w:tc>
+      </w:tr>
+      <w:tr>
+        <w:tc>
+          <w:tcPr>
+            <w:tcW w:w="2400" w:type="dxa"/>
+            <w:tcBorders>
+              <w:top w:val="single" w:sz="1" w:space="0" w:color="CCCCCC"/>
+              <w:left w:val="single" w:sz="1" w:space="0" w:color="CCCCCC"/>
+              <w:bottom w:val="single" w:sz="1" w:space="0" w:color="CCCCCC"/>
+              <w:right w:val="single" w:sz="1" w:space="0" w:color="CCCCCC"/>
+            </w:tcBorders>
+            <w:shd w:val="clear" w:color="auto" w:fill="F5F5F5"/>
+            <w:tcMar>
+              <w:top w:w="80" w:type="dxa"/>
+              <w:left w:w="120" w:type="dxa"/>
+              <w:bottom w:w="80" w:type="dxa"/>
+              <w:right w:w="120" w:type="dxa"/>
+            </w:tcMar>
+          </w:tcPr>
+          <w:p>
+            <w:pPr>
+              <w:rPr>
+                <w:sz w:val="20"/>
+                <w:szCs w:val="20"/>
+              </w:rPr>
+            </w:pPr>
+            <w:proofErr w:type="spellStart"/>
+            <w:r>
+              <w:rPr>
+                <w:sz w:val="20"/>
+                <w:szCs w:val="20"/>
+              </w:rPr>
+              <w:t>L</w:t>
+            </w:r>
+            <w:r>
+              <w:rPr>
+                <w:sz w:val="20"/>
+                <w:szCs w:val="20"/>
+              </w:rPr>
+              <w:t>ucide</w:t>
+            </w:r>
+            <w:proofErr w:type="spellEnd"/>
+          </w:p>
+        </w:tc>
+        <w:tc>
+          <w:tcPr>
+            <w:tcW w:w="2800" w:type="dxa"/>
+            <w:tcBorders>
+              <w:top w:val="single" w:sz="1" w:space="0" w:color="CCCCCC"/>
+              <w:left w:val="single" w:sz="1" w:space="0" w:color="CCCCCC"/>
+              <w:bottom w:val="single" w:sz="1" w:space="0" w:color="CCCCCC"/>
+              <w:right w:val="single" w:sz="1" w:space="0" w:color="CCCCCC"/>
+            </w:tcBorders>
+            <w:shd w:val="clear" w:color="auto" w:fill="F5F5F5"/>
+            <w:tcMar>
+              <w:top w:w="80" w:type="dxa"/>
+              <w:left w:w="120" w:type="dxa"/>
+              <w:bottom w:w="80" w:type="dxa"/>
+              <w:right w:w="120" w:type="dxa"/>
+            </w:tcMar>
+          </w:tcPr>
+          <w:p>
+            <w:pPr>
+              <w:rPr>
+                <w:sz w:val="20"/>
+                <w:szCs w:val="20"/>
+              </w:rPr>
+            </w:pPr>
+            <w:r>
+              <w:rPr>
+                <w:sz w:val="20"/>
+                <w:szCs w:val="20"/>
+              </w:rPr>
+              <w:t xml:space="preserve">Icon thing </w:t>
+            </w:r>
+          </w:p>
+        </w:tc>
+        <w:tc>
+          <w:tcPr>
+            <w:tcW w:w="4160" w:type="dxa"/>
+            <w:tcBorders>
+              <w:top w:val="single" w:sz="1" w:space="0" w:color="CCCCCC"/>
+              <w:left w:val="single" w:sz="1" w:space="0" w:color="CCCCCC"/>
+              <w:bottom w:val="single" w:sz="1" w:space="0" w:color="CCCCCC"/>
+              <w:right w:val="single" w:sz="1" w:space="0" w:color="CCCCCC"/>
+            </w:tcBorders>
+            <w:shd w:val="clear" w:color="auto" w:fill="F5F5F5"/>
+            <w:tcMar>
+              <w:top w:w="80" w:type="dxa"/>
+              <w:left w:w="120" w:type="dxa"/>
+              <w:bottom w:w="80" w:type="dxa"/>
+              <w:right w:w="120" w:type="dxa"/>
+            </w:tcMar>
+          </w:tcPr>
+          <w:p>
+            <w:pPr>
+              <w:rPr>
+                <w:sz w:val="20"/>
+                <w:szCs w:val="20"/>
+              </w:rPr>
+            </w:pPr>
+            <w:r>
+              <w:rPr>
+                <w:sz w:val="20"/>
+                <w:szCs w:val="20"/>
+              </w:rPr>
+              <w:t>Easy to use – Import icons and use them directly in JSX.</w:t>
             </w:r>
           </w:p>
         </w:tc>
@@ -5816,6 +5632,8 @@
       <w:r>
         <w:t>2. Frontend Project Structure</w:t>
       </w:r>
+      <w:bookmarkStart w:id="0" w:name="_GoBack"/>
+      <w:bookmarkEnd w:id="0"/>
     </w:p>
     <w:p>
       <w:pPr>
@@ -6154,7 +5972,7 @@
           <w:sz w:val="18"/>
           <w:szCs w:val="18"/>
         </w:rPr>
-        <w:t xml:space="preserve">|   \- layout/           </w:t>
+        <w:t xml:space="preserve">|   \- layout/            </w:t>
       </w:r>
       <w:proofErr w:type="gramStart"/>
       <w:r>
@@ -6164,7 +5982,25 @@
           <w:sz w:val="18"/>
           <w:szCs w:val="18"/>
         </w:rPr>
-        <w:t xml:space="preserve">   (</w:t>
+        <w:t xml:space="preserve">  </w:t>
+      </w:r>
+      <w:r>
+        <w:rPr>
+          <w:rFonts w:ascii="Courier New" w:eastAsia="Courier New" w:hAnsi="Courier New" w:cs="Courier New"/>
+          <w:color w:val="333333"/>
+          <w:sz w:val="18"/>
+          <w:szCs w:val="18"/>
+        </w:rPr>
+        <w:t xml:space="preserve"> </w:t>
+      </w:r>
+      <w:r>
+        <w:rPr>
+          <w:rFonts w:ascii="Courier New" w:eastAsia="Courier New" w:hAnsi="Courier New" w:cs="Courier New"/>
+          <w:color w:val="333333"/>
+          <w:sz w:val="18"/>
+          <w:szCs w:val="18"/>
+        </w:rPr>
+        <w:t>(</w:t>
       </w:r>
       <w:proofErr w:type="gramEnd"/>
       <w:r>
@@ -6246,6 +6082,7 @@
           <w:sz w:val="18"/>
           <w:szCs w:val="18"/>
         </w:rPr>
+        <w:lastRenderedPageBreak/>
         <w:t xml:space="preserve">|- lib/                   </w:t>
       </w:r>
       <w:proofErr w:type="gramStart"/>
@@ -6340,7 +6177,6 @@
           <w:sz w:val="18"/>
           <w:szCs w:val="18"/>
         </w:rPr>
-        <w:lastRenderedPageBreak/>
         <w:t xml:space="preserve">|- types/                 </w:t>
       </w:r>
       <w:proofErr w:type="gramStart"/>
@@ -6821,12 +6657,6 @@
         <w:gridCol w:w="9360"/>
       </w:tblGrid>
       <w:tr>
-        <w:tblPrEx>
-          <w:tblCellMar>
-            <w:top w:w="0" w:type="dxa"/>
-            <w:bottom w:w="0" w:type="dxa"/>
-          </w:tblCellMar>
-        </w:tblPrEx>
         <w:tc>
           <w:tcPr>
             <w:tcW w:w="9360" w:type="dxa"/>
@@ -6875,19 +6705,7 @@
                 <w:sz w:val="20"/>
                 <w:szCs w:val="20"/>
               </w:rPr>
-              <w:t xml:space="preserve"> module structure (auth, user, product, order). This </w:t>
-            </w:r>
-            <w:bookmarkStart w:id="0" w:name="_GoBack"/>
-            <w:bookmarkEnd w:id="0"/>
-            <w:r>
-              <w:rPr>
-                <w:i/>
-                <w:iCs/>
-                <w:color w:val="1A5C38"/>
-                <w:sz w:val="20"/>
-                <w:szCs w:val="20"/>
-              </w:rPr>
-              <w:t>alignment makes API integration intuitive for the whole team.</w:t>
+              <w:t xml:space="preserve"> module structure (auth, user, product, order). This alignment makes API integration intuitive for the whole team.</w:t>
             </w:r>
           </w:p>
         </w:tc>
@@ -6932,12 +6750,6 @@
         <w:gridCol w:w="3760"/>
       </w:tblGrid>
       <w:tr>
-        <w:tblPrEx>
-          <w:tblCellMar>
-            <w:top w:w="0" w:type="dxa"/>
-            <w:bottom w:w="0" w:type="dxa"/>
-          </w:tblCellMar>
-        </w:tblPrEx>
         <w:trPr>
           <w:tblHeader/>
         </w:trPr>
@@ -7036,12 +6848,6 @@
         </w:tc>
       </w:tr>
       <w:tr>
-        <w:tblPrEx>
-          <w:tblCellMar>
-            <w:top w:w="0" w:type="dxa"/>
-            <w:bottom w:w="0" w:type="dxa"/>
-          </w:tblCellMar>
-        </w:tblPrEx>
         <w:tc>
           <w:tcPr>
             <w:tcW w:w="2400" w:type="dxa"/>
@@ -7168,12 +6974,6 @@
         </w:tc>
       </w:tr>
       <w:tr>
-        <w:tblPrEx>
-          <w:tblCellMar>
-            <w:top w:w="0" w:type="dxa"/>
-            <w:bottom w:w="0" w:type="dxa"/>
-          </w:tblCellMar>
-        </w:tblPrEx>
         <w:tc>
           <w:tcPr>
             <w:tcW w:w="2400" w:type="dxa"/>
@@ -7275,12 +7075,6 @@
         </w:tc>
       </w:tr>
       <w:tr>
-        <w:tblPrEx>
-          <w:tblCellMar>
-            <w:top w:w="0" w:type="dxa"/>
-            <w:bottom w:w="0" w:type="dxa"/>
-          </w:tblCellMar>
-        </w:tblPrEx>
         <w:tc>
           <w:tcPr>
             <w:tcW w:w="2400" w:type="dxa"/>
@@ -7398,12 +7192,6 @@
         </w:tc>
       </w:tr>
       <w:tr>
-        <w:tblPrEx>
-          <w:tblCellMar>
-            <w:top w:w="0" w:type="dxa"/>
-            <w:bottom w:w="0" w:type="dxa"/>
-          </w:tblCellMar>
-        </w:tblPrEx>
         <w:tc>
           <w:tcPr>
             <w:tcW w:w="2400" w:type="dxa"/>
@@ -7514,12 +7302,6 @@
         </w:tc>
       </w:tr>
       <w:tr>
-        <w:tblPrEx>
-          <w:tblCellMar>
-            <w:top w:w="0" w:type="dxa"/>
-            <w:bottom w:w="0" w:type="dxa"/>
-          </w:tblCellMar>
-        </w:tblPrEx>
         <w:tc>
           <w:tcPr>
             <w:tcW w:w="2400" w:type="dxa"/>
@@ -7621,12 +7403,6 @@
         </w:tc>
       </w:tr>
       <w:tr>
-        <w:tblPrEx>
-          <w:tblCellMar>
-            <w:top w:w="0" w:type="dxa"/>
-            <w:bottom w:w="0" w:type="dxa"/>
-          </w:tblCellMar>
-        </w:tblPrEx>
         <w:tc>
           <w:tcPr>
             <w:tcW w:w="2400" w:type="dxa"/>
@@ -7710,12 +7486,6 @@
         </w:tc>
       </w:tr>
       <w:tr>
-        <w:tblPrEx>
-          <w:tblCellMar>
-            <w:top w:w="0" w:type="dxa"/>
-            <w:bottom w:w="0" w:type="dxa"/>
-          </w:tblCellMar>
-        </w:tblPrEx>
         <w:tc>
           <w:tcPr>
             <w:tcW w:w="2400" w:type="dxa"/>
@@ -7824,12 +7594,6 @@
         </w:tc>
       </w:tr>
       <w:tr>
-        <w:tblPrEx>
-          <w:tblCellMar>
-            <w:top w:w="0" w:type="dxa"/>
-            <w:bottom w:w="0" w:type="dxa"/>
-          </w:tblCellMar>
-        </w:tblPrEx>
         <w:tc>
           <w:tcPr>
             <w:tcW w:w="2400" w:type="dxa"/>
@@ -7931,12 +7695,6 @@
         </w:tc>
       </w:tr>
       <w:tr>
-        <w:tblPrEx>
-          <w:tblCellMar>
-            <w:top w:w="0" w:type="dxa"/>
-            <w:bottom w:w="0" w:type="dxa"/>
-          </w:tblCellMar>
-        </w:tblPrEx>
         <w:tc>
           <w:tcPr>
             <w:tcW w:w="2400" w:type="dxa"/>
@@ -8067,12 +7825,6 @@
         <w:gridCol w:w="3960"/>
       </w:tblGrid>
       <w:tr>
-        <w:tblPrEx>
-          <w:tblCellMar>
-            <w:top w:w="0" w:type="dxa"/>
-            <w:bottom w:w="0" w:type="dxa"/>
-          </w:tblCellMar>
-        </w:tblPrEx>
         <w:trPr>
           <w:tblHeader/>
         </w:trPr>
@@ -8171,12 +7923,6 @@
         </w:tc>
       </w:tr>
       <w:tr>
-        <w:tblPrEx>
-          <w:tblCellMar>
-            <w:top w:w="0" w:type="dxa"/>
-            <w:bottom w:w="0" w:type="dxa"/>
-          </w:tblCellMar>
-        </w:tblPrEx>
         <w:tc>
           <w:tcPr>
             <w:tcW w:w="1800" w:type="dxa"/>
@@ -8260,12 +8006,6 @@
         </w:tc>
       </w:tr>
       <w:tr>
-        <w:tblPrEx>
-          <w:tblCellMar>
-            <w:top w:w="0" w:type="dxa"/>
-            <w:bottom w:w="0" w:type="dxa"/>
-          </w:tblCellMar>
-        </w:tblPrEx>
         <w:tc>
           <w:tcPr>
             <w:tcW w:w="1800" w:type="dxa"/>
@@ -8289,6 +8029,7 @@
                 <w:sz w:val="20"/>
                 <w:szCs w:val="20"/>
               </w:rPr>
+              <w:lastRenderedPageBreak/>
               <w:t>Molecules</w:t>
             </w:r>
           </w:p>
@@ -8383,12 +8124,6 @@
         </w:tc>
       </w:tr>
       <w:tr>
-        <w:tblPrEx>
-          <w:tblCellMar>
-            <w:top w:w="0" w:type="dxa"/>
-            <w:bottom w:w="0" w:type="dxa"/>
-          </w:tblCellMar>
-        </w:tblPrEx>
         <w:tc>
           <w:tcPr>
             <w:tcW w:w="1800" w:type="dxa"/>
@@ -8412,7 +8147,6 @@
                 <w:sz w:val="20"/>
                 <w:szCs w:val="20"/>
               </w:rPr>
-              <w:lastRenderedPageBreak/>
               <w:t>Organisms</w:t>
             </w:r>
           </w:p>
@@ -8507,12 +8241,6 @@
         </w:tc>
       </w:tr>
       <w:tr>
-        <w:tblPrEx>
-          <w:tblCellMar>
-            <w:top w:w="0" w:type="dxa"/>
-            <w:bottom w:w="0" w:type="dxa"/>
-          </w:tblCellMar>
-        </w:tblPrEx>
         <w:tc>
           <w:tcPr>
             <w:tcW w:w="1800" w:type="dxa"/>
@@ -9513,6 +9241,7 @@
         <w:pStyle w:val="Heading2"/>
       </w:pPr>
       <w:r>
+        <w:lastRenderedPageBreak/>
         <w:t>React Query Hook</w:t>
       </w:r>
     </w:p>
@@ -9612,7 +9341,6 @@
           <w:sz w:val="18"/>
           <w:szCs w:val="18"/>
         </w:rPr>
-        <w:lastRenderedPageBreak/>
         <w:t xml:space="preserve">  return </w:t>
       </w:r>
       <w:proofErr w:type="spellStart"/>
@@ -9797,12 +9525,6 @@
         <w:gridCol w:w="9360"/>
       </w:tblGrid>
       <w:tr>
-        <w:tblPrEx>
-          <w:tblCellMar>
-            <w:top w:w="0" w:type="dxa"/>
-            <w:bottom w:w="0" w:type="dxa"/>
-          </w:tblCellMar>
-        </w:tblPrEx>
         <w:tc>
           <w:tcPr>
             <w:tcW w:w="9360" w:type="dxa"/>
@@ -9896,12 +9618,6 @@
         <w:gridCol w:w="3960"/>
       </w:tblGrid>
       <w:tr>
-        <w:tblPrEx>
-          <w:tblCellMar>
-            <w:top w:w="0" w:type="dxa"/>
-            <w:bottom w:w="0" w:type="dxa"/>
-          </w:tblCellMar>
-        </w:tblPrEx>
         <w:trPr>
           <w:tblHeader/>
         </w:trPr>
@@ -10000,12 +9716,6 @@
         </w:tc>
       </w:tr>
       <w:tr>
-        <w:tblPrEx>
-          <w:tblCellMar>
-            <w:top w:w="0" w:type="dxa"/>
-            <w:bottom w:w="0" w:type="dxa"/>
-          </w:tblCellMar>
-        </w:tblPrEx>
         <w:tc>
           <w:tcPr>
             <w:tcW w:w="3000" w:type="dxa"/>
@@ -10089,12 +9799,6 @@
         </w:tc>
       </w:tr>
       <w:tr>
-        <w:tblPrEx>
-          <w:tblCellMar>
-            <w:top w:w="0" w:type="dxa"/>
-            <w:bottom w:w="0" w:type="dxa"/>
-          </w:tblCellMar>
-        </w:tblPrEx>
         <w:tc>
           <w:tcPr>
             <w:tcW w:w="3000" w:type="dxa"/>
@@ -10180,12 +9884,6 @@
         </w:tc>
       </w:tr>
       <w:tr>
-        <w:tblPrEx>
-          <w:tblCellMar>
-            <w:top w:w="0" w:type="dxa"/>
-            <w:bottom w:w="0" w:type="dxa"/>
-          </w:tblCellMar>
-        </w:tblPrEx>
         <w:tc>
           <w:tcPr>
             <w:tcW w:w="3000" w:type="dxa"/>
@@ -10287,12 +9985,6 @@
         </w:tc>
       </w:tr>
       <w:tr>
-        <w:tblPrEx>
-          <w:tblCellMar>
-            <w:top w:w="0" w:type="dxa"/>
-            <w:bottom w:w="0" w:type="dxa"/>
-          </w:tblCellMar>
-        </w:tblPrEx>
         <w:tc>
           <w:tcPr>
             <w:tcW w:w="3000" w:type="dxa"/>
@@ -10385,12 +10077,6 @@
         </w:tc>
       </w:tr>
       <w:tr>
-        <w:tblPrEx>
-          <w:tblCellMar>
-            <w:top w:w="0" w:type="dxa"/>
-            <w:bottom w:w="0" w:type="dxa"/>
-          </w:tblCellMar>
-        </w:tblPrEx>
         <w:tc>
           <w:tcPr>
             <w:tcW w:w="3000" w:type="dxa"/>
@@ -10509,12 +10195,6 @@
         <w:gridCol w:w="9360"/>
       </w:tblGrid>
       <w:tr>
-        <w:tblPrEx>
-          <w:tblCellMar>
-            <w:top w:w="0" w:type="dxa"/>
-            <w:bottom w:w="0" w:type="dxa"/>
-          </w:tblCellMar>
-        </w:tblPrEx>
         <w:tc>
           <w:tcPr>
             <w:tcW w:w="9360" w:type="dxa"/>
@@ -11049,6 +10729,7 @@
           <w:sz w:val="18"/>
           <w:szCs w:val="18"/>
         </w:rPr>
+        <w:lastRenderedPageBreak/>
         <w:t xml:space="preserve">  = </w:t>
       </w:r>
       <w:proofErr w:type="spellStart"/>
@@ -11156,7 +10837,6 @@
         </w:pBdr>
       </w:pPr>
       <w:r>
-        <w:lastRenderedPageBreak/>
         <w:t>8. TypeScript Best Practices</w:t>
       </w:r>
     </w:p>
@@ -11324,12 +11004,6 @@
         <w:gridCol w:w="2600"/>
       </w:tblGrid>
       <w:tr>
-        <w:tblPrEx>
-          <w:tblCellMar>
-            <w:top w:w="0" w:type="dxa"/>
-            <w:bottom w:w="0" w:type="dxa"/>
-          </w:tblCellMar>
-        </w:tblPrEx>
         <w:trPr>
           <w:tblHeader/>
         </w:trPr>
@@ -11428,12 +11102,6 @@
         </w:tc>
       </w:tr>
       <w:tr>
-        <w:tblPrEx>
-          <w:tblCellMar>
-            <w:top w:w="0" w:type="dxa"/>
-            <w:bottom w:w="0" w:type="dxa"/>
-          </w:tblCellMar>
-        </w:tblPrEx>
         <w:tc>
           <w:tcPr>
             <w:tcW w:w="2400" w:type="dxa"/>
@@ -11542,12 +11210,6 @@
         </w:tc>
       </w:tr>
       <w:tr>
-        <w:tblPrEx>
-          <w:tblCellMar>
-            <w:top w:w="0" w:type="dxa"/>
-            <w:bottom w:w="0" w:type="dxa"/>
-          </w:tblCellMar>
-        </w:tblPrEx>
         <w:tc>
           <w:tcPr>
             <w:tcW w:w="2400" w:type="dxa"/>
@@ -11631,12 +11293,6 @@
         </w:tc>
       </w:tr>
       <w:tr>
-        <w:tblPrEx>
-          <w:tblCellMar>
-            <w:top w:w="0" w:type="dxa"/>
-            <w:bottom w:w="0" w:type="dxa"/>
-          </w:tblCellMar>
-        </w:tblPrEx>
         <w:tc>
           <w:tcPr>
             <w:tcW w:w="2400" w:type="dxa"/>
@@ -11720,12 +11376,6 @@
         </w:tc>
       </w:tr>
       <w:tr>
-        <w:tblPrEx>
-          <w:tblCellMar>
-            <w:top w:w="0" w:type="dxa"/>
-            <w:bottom w:w="0" w:type="dxa"/>
-          </w:tblCellMar>
-        </w:tblPrEx>
         <w:tc>
           <w:tcPr>
             <w:tcW w:w="2400" w:type="dxa"/>
@@ -11835,12 +11485,6 @@
         <w:gridCol w:w="9360"/>
       </w:tblGrid>
       <w:tr>
-        <w:tblPrEx>
-          <w:tblCellMar>
-            <w:top w:w="0" w:type="dxa"/>
-            <w:bottom w:w="0" w:type="dxa"/>
-          </w:tblCellMar>
-        </w:tblPrEx>
         <w:tc>
           <w:tcPr>
             <w:tcW w:w="9360" w:type="dxa"/>
@@ -12117,6 +11761,7 @@
           <w:sz w:val="18"/>
           <w:szCs w:val="18"/>
         </w:rPr>
+        <w:lastRenderedPageBreak/>
         <w:t xml:space="preserve">    '/</w:t>
       </w:r>
       <w:proofErr w:type="spellStart"/>
@@ -12508,12 +12153,6 @@
         <w:gridCol w:w="6160"/>
       </w:tblGrid>
       <w:tr>
-        <w:tblPrEx>
-          <w:tblCellMar>
-            <w:top w:w="0" w:type="dxa"/>
-            <w:bottom w:w="0" w:type="dxa"/>
-          </w:tblCellMar>
-        </w:tblPrEx>
         <w:trPr>
           <w:tblHeader/>
         </w:trPr>
@@ -12581,12 +12220,6 @@
         </w:tc>
       </w:tr>
       <w:tr>
-        <w:tblPrEx>
-          <w:tblCellMar>
-            <w:top w:w="0" w:type="dxa"/>
-            <w:bottom w:w="0" w:type="dxa"/>
-          </w:tblCellMar>
-        </w:tblPrEx>
         <w:tc>
           <w:tcPr>
             <w:tcW w:w="3200" w:type="dxa"/>
@@ -12652,12 +12285,6 @@
         </w:tc>
       </w:tr>
       <w:tr>
-        <w:tblPrEx>
-          <w:tblCellMar>
-            <w:top w:w="0" w:type="dxa"/>
-            <w:bottom w:w="0" w:type="dxa"/>
-          </w:tblCellMar>
-        </w:tblPrEx>
         <w:tc>
           <w:tcPr>
             <w:tcW w:w="3200" w:type="dxa"/>
@@ -12723,12 +12350,6 @@
         </w:tc>
       </w:tr>
       <w:tr>
-        <w:tblPrEx>
-          <w:tblCellMar>
-            <w:top w:w="0" w:type="dxa"/>
-            <w:bottom w:w="0" w:type="dxa"/>
-          </w:tblCellMar>
-        </w:tblPrEx>
         <w:tc>
           <w:tcPr>
             <w:tcW w:w="3200" w:type="dxa"/>
@@ -12826,12 +12447,6 @@
         </w:tc>
       </w:tr>
       <w:tr>
-        <w:tblPrEx>
-          <w:tblCellMar>
-            <w:top w:w="0" w:type="dxa"/>
-            <w:bottom w:w="0" w:type="dxa"/>
-          </w:tblCellMar>
-        </w:tblPrEx>
         <w:tc>
           <w:tcPr>
             <w:tcW w:w="3200" w:type="dxa"/>
@@ -12888,12 +12503,6 @@
         </w:tc>
       </w:tr>
       <w:tr>
-        <w:tblPrEx>
-          <w:tblCellMar>
-            <w:top w:w="0" w:type="dxa"/>
-            <w:bottom w:w="0" w:type="dxa"/>
-          </w:tblCellMar>
-        </w:tblPrEx>
         <w:tc>
           <w:tcPr>
             <w:tcW w:w="3200" w:type="dxa"/>
@@ -12950,12 +12559,6 @@
         </w:tc>
       </w:tr>
       <w:tr>
-        <w:tblPrEx>
-          <w:tblCellMar>
-            <w:top w:w="0" w:type="dxa"/>
-            <w:bottom w:w="0" w:type="dxa"/>
-          </w:tblCellMar>
-        </w:tblPrEx>
         <w:tc>
           <w:tcPr>
             <w:tcW w:w="3200" w:type="dxa"/>
@@ -13054,12 +12657,6 @@
         <w:gridCol w:w="9360"/>
       </w:tblGrid>
       <w:tr>
-        <w:tblPrEx>
-          <w:tblCellMar>
-            <w:top w:w="0" w:type="dxa"/>
-            <w:bottom w:w="0" w:type="dxa"/>
-          </w:tblCellMar>
-        </w:tblPrEx>
         <w:tc>
           <w:tcPr>
             <w:tcW w:w="9360" w:type="dxa"/>
@@ -13152,12 +12749,6 @@
         <w:gridCol w:w="5160"/>
       </w:tblGrid>
       <w:tr>
-        <w:tblPrEx>
-          <w:tblCellMar>
-            <w:top w:w="0" w:type="dxa"/>
-            <w:bottom w:w="0" w:type="dxa"/>
-          </w:tblCellMar>
-        </w:tblPrEx>
         <w:trPr>
           <w:tblHeader/>
         </w:trPr>
@@ -13225,12 +12816,6 @@
         </w:tc>
       </w:tr>
       <w:tr>
-        <w:tblPrEx>
-          <w:tblCellMar>
-            <w:top w:w="0" w:type="dxa"/>
-            <w:bottom w:w="0" w:type="dxa"/>
-          </w:tblCellMar>
-        </w:tblPrEx>
         <w:tc>
           <w:tcPr>
             <w:tcW w:w="4200" w:type="dxa"/>
@@ -13296,12 +12881,6 @@
         </w:tc>
       </w:tr>
       <w:tr>
-        <w:tblPrEx>
-          <w:tblCellMar>
-            <w:top w:w="0" w:type="dxa"/>
-            <w:bottom w:w="0" w:type="dxa"/>
-          </w:tblCellMar>
-        </w:tblPrEx>
         <w:tc>
           <w:tcPr>
             <w:tcW w:w="4200" w:type="dxa"/>
@@ -13376,12 +12955,6 @@
         </w:tc>
       </w:tr>
       <w:tr>
-        <w:tblPrEx>
-          <w:tblCellMar>
-            <w:top w:w="0" w:type="dxa"/>
-            <w:bottom w:w="0" w:type="dxa"/>
-          </w:tblCellMar>
-        </w:tblPrEx>
         <w:tc>
           <w:tcPr>
             <w:tcW w:w="4200" w:type="dxa"/>
@@ -13463,12 +13036,6 @@
         </w:tc>
       </w:tr>
       <w:tr>
-        <w:tblPrEx>
-          <w:tblCellMar>
-            <w:top w:w="0" w:type="dxa"/>
-            <w:bottom w:w="0" w:type="dxa"/>
-          </w:tblCellMar>
-        </w:tblPrEx>
         <w:tc>
           <w:tcPr>
             <w:tcW w:w="4200" w:type="dxa"/>
@@ -13550,12 +13117,6 @@
         </w:tc>
       </w:tr>
       <w:tr>
-        <w:tblPrEx>
-          <w:tblCellMar>
-            <w:top w:w="0" w:type="dxa"/>
-            <w:bottom w:w="0" w:type="dxa"/>
-          </w:tblCellMar>
-        </w:tblPrEx>
         <w:tc>
           <w:tcPr>
             <w:tcW w:w="4200" w:type="dxa"/>
@@ -13621,12 +13182,6 @@
         </w:tc>
       </w:tr>
       <w:tr>
-        <w:tblPrEx>
-          <w:tblCellMar>
-            <w:top w:w="0" w:type="dxa"/>
-            <w:bottom w:w="0" w:type="dxa"/>
-          </w:tblCellMar>
-        </w:tblPrEx>
         <w:tc>
           <w:tcPr>
             <w:tcW w:w="4200" w:type="dxa"/>
@@ -13708,12 +13263,6 @@
         </w:tc>
       </w:tr>
       <w:tr>
-        <w:tblPrEx>
-          <w:tblCellMar>
-            <w:top w:w="0" w:type="dxa"/>
-            <w:bottom w:w="0" w:type="dxa"/>
-          </w:tblCellMar>
-        </w:tblPrEx>
         <w:tc>
           <w:tcPr>
             <w:tcW w:w="4200" w:type="dxa"/>
@@ -14047,12 +13596,6 @@
         <w:gridCol w:w="3480"/>
       </w:tblGrid>
       <w:tr>
-        <w:tblPrEx>
-          <w:tblCellMar>
-            <w:top w:w="0" w:type="dxa"/>
-            <w:bottom w:w="0" w:type="dxa"/>
-          </w:tblCellMar>
-        </w:tblPrEx>
         <w:trPr>
           <w:tblHeader/>
         </w:trPr>
@@ -14151,12 +13694,6 @@
         </w:tc>
       </w:tr>
       <w:tr>
-        <w:tblPrEx>
-          <w:tblCellMar>
-            <w:top w:w="0" w:type="dxa"/>
-            <w:bottom w:w="0" w:type="dxa"/>
-          </w:tblCellMar>
-        </w:tblPrEx>
         <w:tc>
           <w:tcPr>
             <w:tcW w:w="2400" w:type="dxa"/>
@@ -14267,12 +13804,6 @@
         </w:tc>
       </w:tr>
       <w:tr>
-        <w:tblPrEx>
-          <w:tblCellMar>
-            <w:top w:w="0" w:type="dxa"/>
-            <w:bottom w:w="0" w:type="dxa"/>
-          </w:tblCellMar>
-        </w:tblPrEx>
         <w:tc>
           <w:tcPr>
             <w:tcW w:w="2400" w:type="dxa"/>
@@ -14356,12 +13887,6 @@
         </w:tc>
       </w:tr>
       <w:tr>
-        <w:tblPrEx>
-          <w:tblCellMar>
-            <w:top w:w="0" w:type="dxa"/>
-            <w:bottom w:w="0" w:type="dxa"/>
-          </w:tblCellMar>
-        </w:tblPrEx>
         <w:tc>
           <w:tcPr>
             <w:tcW w:w="2400" w:type="dxa"/>
@@ -14445,12 +13970,6 @@
         </w:tc>
       </w:tr>
       <w:tr>
-        <w:tblPrEx>
-          <w:tblCellMar>
-            <w:top w:w="0" w:type="dxa"/>
-            <w:bottom w:w="0" w:type="dxa"/>
-          </w:tblCellMar>
-        </w:tblPrEx>
         <w:tc>
           <w:tcPr>
             <w:tcW w:w="2400" w:type="dxa"/>
@@ -14575,12 +14094,6 @@
         </w:tc>
       </w:tr>
       <w:tr>
-        <w:tblPrEx>
-          <w:tblCellMar>
-            <w:top w:w="0" w:type="dxa"/>
-            <w:bottom w:w="0" w:type="dxa"/>
-          </w:tblCellMar>
-        </w:tblPrEx>
         <w:tc>
           <w:tcPr>
             <w:tcW w:w="2400" w:type="dxa"/>

</xml_diff>

<commit_message>
feat: protected routes, and desiging modules user management
</commit_message>
<xml_diff>
--- a/document/FullStack_Convention_Or_Best_practice_Guide.docx
+++ b/document/FullStack_Convention_Or_Best_practice_Guide.docx
@@ -57,7 +57,6 @@
         </w:rPr>
         <w:t xml:space="preserve">Spring Boot + </w:t>
       </w:r>
-      <w:proofErr w:type="gramStart"/>
       <w:r>
         <w:rPr>
           <w:i/>
@@ -66,9 +65,8 @@
           <w:sz w:val="26"/>
           <w:szCs w:val="26"/>
         </w:rPr>
-        <w:t>PostgreSQL  |</w:t>
-      </w:r>
-      <w:proofErr w:type="gramEnd"/>
+        <w:t>PostgreSQL | React</w:t>
+      </w:r>
       <w:r>
         <w:rPr>
           <w:i/>
@@ -77,7 +75,7 @@
           <w:sz w:val="26"/>
           <w:szCs w:val="26"/>
         </w:rPr>
-        <w:t xml:space="preserve">  React + TypeScript</w:t>
+        <w:t xml:space="preserve"> + TypeScript</w:t>
       </w:r>
     </w:p>
     <w:p>
@@ -5632,8 +5630,6 @@
       <w:r>
         <w:t>2. Frontend Project Structure</w:t>
       </w:r>
-      <w:bookmarkStart w:id="0" w:name="_GoBack"/>
-      <w:bookmarkEnd w:id="0"/>
     </w:p>
     <w:p>
       <w:pPr>
@@ -14631,7 +14627,17 @@
           <w:iCs/>
           <w:color w:val="888888"/>
         </w:rPr>
-        <w:t>2026  |</w:t>
+        <w:t>202</w:t>
+      </w:r>
+      <w:bookmarkStart w:id="0" w:name="_GoBack"/>
+      <w:bookmarkEnd w:id="0"/>
+      <w:r>
+        <w:rPr>
+          <w:i/>
+          <w:iCs/>
+          <w:color w:val="888888"/>
+        </w:rPr>
+        <w:t>6  |</w:t>
       </w:r>
       <w:proofErr w:type="gramEnd"/>
       <w:r>

</xml_diff>